<commit_message>
Added header and files are ok
</commit_message>
<xml_diff>
--- a/PracticalProject1/Report 2- CST8002.docx
+++ b/PracticalProject1/Report 2- CST8002.docx
@@ -3,9 +3,2577 @@
 <w:document xmlns:wpc="http://schemas.microsoft.com/office/word/2010/wordprocessingCanvas" xmlns:cx="http://schemas.microsoft.com/office/drawing/2014/chartex" xmlns:cx1="http://schemas.microsoft.com/office/drawing/2015/9/8/chartex" xmlns:cx2="http://schemas.microsoft.com/office/drawing/2015/10/21/chartex" xmlns:cx3="http://schemas.microsoft.com/office/drawing/2016/5/9/chartex" xmlns:cx4="http://schemas.microsoft.com/office/drawing/2016/5/10/chartex" xmlns:cx5="http://schemas.microsoft.com/office/drawing/2016/5/11/chartex" xmlns:cx6="http://schemas.microsoft.com/office/drawing/2016/5/12/chartex" xmlns:cx7="http://schemas.microsoft.com/office/drawing/2016/5/13/chartex" xmlns:cx8="http://schemas.microsoft.com/office/drawing/2016/5/14/chartex" xmlns:mc="http://schemas.openxmlformats.org/markup-compatibility/2006" xmlns:aink="http://schemas.microsoft.com/office/drawing/2016/ink" xmlns:am3d="http://schemas.microsoft.com/office/drawing/2017/model3d" xmlns:o="urn:schemas-microsoft-com:office:office" xmlns:oel="http://schemas.microsoft.com/office/2019/extlst" xmlns:r="http://schemas.openxmlformats.org/officeDocument/2006/relationships" xmlns:m="http://schemas.openxmlformats.org/officeDocument/2006/math" xmlns:v="urn:schemas-microsoft-com:vml" xmlns:wp14="http://schemas.microsoft.com/office/word/2010/wordprocessingDrawing" xmlns:wp="http://schemas.openxmlformats.org/drawingml/2006/wordprocessingDrawing" xmlns:w10="urn:schemas-microsoft-com:office:word" xmlns:w="http://schemas.openxmlformats.org/wordprocessingml/2006/main" xmlns:w14="http://schemas.microsoft.com/office/word/2010/wordml" xmlns:w15="http://schemas.microsoft.com/office/word/2012/wordml" xmlns:w16cex="http://schemas.microsoft.com/office/word/2018/wordml/cex" xmlns:w16cid="http://schemas.microsoft.com/office/word/2016/wordml/cid" xmlns:w16="http://schemas.microsoft.com/office/word/2018/wordml" xmlns:w16du="http://schemas.microsoft.com/office/word/2023/wordml/word16du" xmlns:w16sdtdh="http://schemas.microsoft.com/office/word/2020/wordml/sdtdatahash" xmlns:w16sdtfl="http://schemas.microsoft.com/office/word/2024/wordml/sdtformatlock" xmlns:w16se="http://schemas.microsoft.com/office/word/2015/wordml/symex" xmlns:wpg="http://schemas.microsoft.com/office/word/2010/wordprocessingGroup" xmlns:wpi="http://schemas.microsoft.com/office/word/2010/wordprocessingInk" xmlns:wne="http://schemas.microsoft.com/office/word/2006/wordml" xmlns:wps="http://schemas.microsoft.com/office/word/2010/wordprocessingShape" mc:Ignorable="w14 w15 w16se w16cid w16 w16cex w16sdtdh w16sdtfl w16du wp14">
   <w:body>
     <w:p>
-      <w:r>
-        <w:t>report</w:t>
-      </w:r>
+      <w:pPr>
+        <w:spacing w:after="160" w:line="276" w:lineRule="auto"/>
+        <w:ind w:left="2160"/>
+        <w:rPr>
+          <w:rFonts w:ascii="Calibri" w:eastAsia="Aptos" w:hAnsi="Calibri" w:cs="Calibri"/>
+          <w:kern w:val="2"/>
+          <w:sz w:val="22"/>
+          <w:szCs w:val="22"/>
+          <w:lang w:val="en-US" w:eastAsia="en-US"/>
+        </w:rPr>
+      </w:pPr>
+      <w:r>
+        <w:rPr>
+          <w:rFonts w:ascii="Calibri" w:eastAsia="Aptos" w:hAnsi="Calibri" w:cs="Calibri"/>
+          <w:kern w:val="2"/>
+          <w:sz w:val="22"/>
+          <w:szCs w:val="22"/>
+          <w:lang w:val="en-US" w:eastAsia="en-US"/>
+        </w:rPr>
+        <w:t>CST8002 Programming Language Research Project</w:t>
+      </w:r>
+    </w:p>
+    <w:p>
+      <w:pPr>
+        <w:spacing w:after="160" w:line="276" w:lineRule="auto"/>
+        <w:jc w:val="center"/>
+        <w:rPr>
+          <w:rFonts w:ascii="Calibri" w:eastAsia="Aptos" w:hAnsi="Calibri" w:cs="Calibri"/>
+          <w:b/>
+          <w:bCs/>
+          <w:kern w:val="2"/>
+          <w:sz w:val="24"/>
+          <w:szCs w:val="24"/>
+          <w:lang w:val="en-US" w:eastAsia="en-US"/>
+        </w:rPr>
+      </w:pPr>
+      <w:r>
+        <w:rPr>
+          <w:rFonts w:ascii="Calibri" w:eastAsia="Aptos" w:hAnsi="Calibri" w:cs="Calibri"/>
+          <w:kern w:val="2"/>
+          <w:sz w:val="22"/>
+          <w:szCs w:val="22"/>
+          <w:lang w:val="en-US" w:eastAsia="en-US"/>
+        </w:rPr>
+        <w:t>Evidence of Learning</w:t>
+      </w:r>
+    </w:p>
+    <w:p>
+      <w:pPr>
+        <w:spacing w:after="160" w:line="276" w:lineRule="auto"/>
+        <w:jc w:val="center"/>
+        <w:rPr>
+          <w:rFonts w:ascii="Calibri" w:eastAsia="Aptos" w:hAnsi="Calibri" w:cs="Calibri"/>
+          <w:kern w:val="2"/>
+          <w:sz w:val="24"/>
+          <w:szCs w:val="24"/>
+          <w:lang w:val="en-US" w:eastAsia="en-US"/>
+        </w:rPr>
+      </w:pPr>
+      <w:r>
+        <w:rPr>
+          <w:rFonts w:ascii="Calibri" w:eastAsia="Aptos" w:hAnsi="Calibri" w:cs="Calibri"/>
+          <w:b/>
+          <w:bCs/>
+          <w:kern w:val="2"/>
+          <w:sz w:val="24"/>
+          <w:szCs w:val="24"/>
+          <w:lang w:val="en-US" w:eastAsia="en-US"/>
+        </w:rPr>
+        <w:br/>
+      </w:r>
+      <w:r>
+        <w:rPr>
+          <w:rFonts w:ascii="Calibri" w:eastAsia="Aptos" w:hAnsi="Calibri" w:cs="Calibri"/>
+          <w:kern w:val="2"/>
+          <w:sz w:val="24"/>
+          <w:szCs w:val="24"/>
+          <w:lang w:val="en-US" w:eastAsia="en-US"/>
+        </w:rPr>
+        <w:t xml:space="preserve">Submitted By: Samatar Abdullahi, </w:t>
+      </w:r>
+    </w:p>
+    <w:p>
+      <w:pPr>
+        <w:spacing w:after="160" w:line="276" w:lineRule="auto"/>
+        <w:jc w:val="center"/>
+        <w:rPr>
+          <w:rFonts w:ascii="Calibri" w:eastAsia="Aptos" w:hAnsi="Calibri" w:cs="Calibri"/>
+          <w:kern w:val="2"/>
+          <w:sz w:val="24"/>
+          <w:szCs w:val="24"/>
+          <w:lang w:val="en-US" w:eastAsia="en-US"/>
+        </w:rPr>
+      </w:pPr>
+      <w:r>
+        <w:rPr>
+          <w:rFonts w:ascii="Calibri" w:eastAsia="Aptos" w:hAnsi="Calibri" w:cs="Calibri"/>
+          <w:kern w:val="2"/>
+          <w:sz w:val="24"/>
+          <w:szCs w:val="24"/>
+          <w:lang w:val="en-US" w:eastAsia="en-US"/>
+        </w:rPr>
+        <w:t xml:space="preserve">Student ID: </w:t>
+      </w:r>
+      <w:r>
+        <w:rPr>
+          <w:rFonts w:ascii="Calibri" w:eastAsia="Aptos" w:hAnsi="Calibri" w:cs="Calibri"/>
+          <w:kern w:val="2"/>
+          <w:sz w:val="24"/>
+          <w:szCs w:val="24"/>
+          <w:lang w:val="en-US" w:eastAsia="en-US"/>
+        </w:rPr>
+        <w:t>041198705</w:t>
+      </w:r>
+    </w:p>
+    <w:p>
+      <w:pPr>
+        <w:spacing w:after="160" w:line="276" w:lineRule="auto"/>
+        <w:jc w:val="center"/>
+        <w:rPr>
+          <w:rFonts w:ascii="Calibri" w:eastAsia="Aptos" w:hAnsi="Calibri" w:cs="Calibri"/>
+          <w:kern w:val="2"/>
+          <w:sz w:val="24"/>
+          <w:szCs w:val="24"/>
+          <w:lang w:eastAsia="en-US"/>
+        </w:rPr>
+      </w:pPr>
+    </w:p>
+    <w:p>
+      <w:pPr>
+        <w:spacing w:after="160" w:line="276" w:lineRule="auto"/>
+        <w:rPr>
+          <w:rFonts w:ascii="Calibri" w:eastAsia="Aptos" w:hAnsi="Calibri" w:cs="Calibri"/>
+          <w:kern w:val="2"/>
+          <w:sz w:val="24"/>
+          <w:szCs w:val="24"/>
+          <w:lang w:eastAsia="en-US"/>
+        </w:rPr>
+      </w:pPr>
+    </w:p>
+    <w:p>
+      <w:pPr>
+        <w:spacing w:after="160" w:line="276" w:lineRule="auto"/>
+        <w:jc w:val="center"/>
+        <w:rPr>
+          <w:rFonts w:ascii="Calibri" w:eastAsia="Aptos" w:hAnsi="Calibri" w:cs="Calibri"/>
+          <w:kern w:val="2"/>
+          <w:sz w:val="24"/>
+          <w:szCs w:val="24"/>
+          <w:lang w:val="en-US" w:eastAsia="en-US"/>
+        </w:rPr>
+      </w:pPr>
+      <w:r>
+        <w:rPr>
+          <w:rFonts w:ascii="Calibri" w:eastAsia="Aptos" w:hAnsi="Calibri" w:cs="Calibri"/>
+          <w:kern w:val="2"/>
+          <w:sz w:val="24"/>
+          <w:szCs w:val="24"/>
+          <w:lang w:eastAsia="en-US"/>
+        </w:rPr>
+        <w:br/>
+      </w:r>
+      <w:r>
+        <w:rPr>
+          <w:rFonts w:ascii="Calibri" w:eastAsia="Aptos" w:hAnsi="Calibri" w:cs="Calibri"/>
+          <w:kern w:val="2"/>
+          <w:sz w:val="24"/>
+          <w:szCs w:val="24"/>
+          <w:lang w:val="en-US" w:eastAsia="en-US"/>
+        </w:rPr>
+        <w:t xml:space="preserve">Submitted to: Professor </w:t>
+      </w:r>
+      <w:r>
+        <w:rPr>
+          <w:rFonts w:ascii="Calibri" w:eastAsia="Aptos" w:hAnsi="Calibri" w:cs="Calibri"/>
+          <w:kern w:val="2"/>
+          <w:sz w:val="24"/>
+          <w:szCs w:val="24"/>
+          <w:lang w:val="en-US" w:eastAsia="en-US"/>
+        </w:rPr>
+        <w:t xml:space="preserve">Stanley </w:t>
+      </w:r>
+      <w:proofErr w:type="spellStart"/>
+      <w:r>
+        <w:rPr>
+          <w:rFonts w:ascii="Calibri" w:eastAsia="Aptos" w:hAnsi="Calibri" w:cs="Calibri"/>
+          <w:kern w:val="2"/>
+          <w:sz w:val="24"/>
+          <w:szCs w:val="24"/>
+          <w:lang w:val="en-US" w:eastAsia="en-US"/>
+        </w:rPr>
+        <w:t>Pieda</w:t>
+      </w:r>
+      <w:proofErr w:type="spellEnd"/>
+    </w:p>
+    <w:p>
+      <w:pPr>
+        <w:spacing w:after="160" w:line="276" w:lineRule="auto"/>
+        <w:jc w:val="center"/>
+        <w:rPr>
+          <w:rFonts w:ascii="Calibri" w:eastAsia="Aptos" w:hAnsi="Calibri" w:cs="Calibri"/>
+          <w:kern w:val="2"/>
+          <w:sz w:val="24"/>
+          <w:szCs w:val="24"/>
+          <w:lang w:val="en-US" w:eastAsia="en-US"/>
+        </w:rPr>
+      </w:pPr>
+      <w:r>
+        <w:rPr>
+          <w:rFonts w:ascii="Calibri" w:eastAsia="Aptos" w:hAnsi="Calibri" w:cs="Calibri"/>
+          <w:kern w:val="2"/>
+          <w:sz w:val="24"/>
+          <w:szCs w:val="24"/>
+          <w:lang w:val="en-US" w:eastAsia="en-US"/>
+        </w:rPr>
+        <w:t>in partial fulfillment of the requirements for CST 8</w:t>
+      </w:r>
+      <w:r>
+        <w:rPr>
+          <w:rFonts w:ascii="Calibri" w:eastAsia="Aptos" w:hAnsi="Calibri" w:cs="Calibri"/>
+          <w:kern w:val="2"/>
+          <w:sz w:val="24"/>
+          <w:szCs w:val="24"/>
+          <w:lang w:val="en-US" w:eastAsia="en-US"/>
+        </w:rPr>
+        <w:t>002</w:t>
+      </w:r>
+      <w:r>
+        <w:rPr>
+          <w:rFonts w:ascii="Calibri" w:eastAsia="Aptos" w:hAnsi="Calibri" w:cs="Calibri"/>
+          <w:kern w:val="2"/>
+          <w:sz w:val="24"/>
+          <w:szCs w:val="24"/>
+          <w:lang w:val="en-US" w:eastAsia="en-US"/>
+        </w:rPr>
+        <w:t>_</w:t>
+      </w:r>
+      <w:r>
+        <w:rPr>
+          <w:rFonts w:ascii="Calibri" w:eastAsia="Aptos" w:hAnsi="Calibri" w:cs="Calibri"/>
+          <w:kern w:val="2"/>
+          <w:sz w:val="24"/>
+          <w:szCs w:val="24"/>
+          <w:lang w:val="en-US" w:eastAsia="en-US"/>
+        </w:rPr>
+        <w:t>302</w:t>
+      </w:r>
+    </w:p>
+    <w:p>
+      <w:pPr>
+        <w:spacing w:after="160" w:line="276" w:lineRule="auto"/>
+        <w:jc w:val="center"/>
+        <w:rPr>
+          <w:rFonts w:ascii="Calibri" w:eastAsia="Aptos" w:hAnsi="Calibri" w:cs="Calibri"/>
+          <w:kern w:val="2"/>
+          <w:sz w:val="24"/>
+          <w:szCs w:val="24"/>
+          <w:lang w:val="en-US" w:eastAsia="en-US"/>
+        </w:rPr>
+      </w:pPr>
+    </w:p>
+    <w:p>
+      <w:pPr>
+        <w:spacing w:after="160" w:line="276" w:lineRule="auto"/>
+        <w:jc w:val="center"/>
+        <w:rPr>
+          <w:rFonts w:ascii="Calibri" w:eastAsia="Aptos" w:hAnsi="Calibri" w:cs="Calibri"/>
+          <w:kern w:val="2"/>
+          <w:sz w:val="24"/>
+          <w:szCs w:val="24"/>
+          <w:lang w:val="en-US" w:eastAsia="en-US"/>
+        </w:rPr>
+      </w:pPr>
+    </w:p>
+    <w:p>
+      <w:pPr>
+        <w:spacing w:after="160" w:line="276" w:lineRule="auto"/>
+        <w:jc w:val="center"/>
+        <w:rPr>
+          <w:rFonts w:ascii="Calibri" w:eastAsia="Aptos" w:hAnsi="Calibri" w:cs="Calibri"/>
+          <w:kern w:val="2"/>
+          <w:sz w:val="24"/>
+          <w:szCs w:val="24"/>
+          <w:lang w:val="en-US" w:eastAsia="en-US"/>
+        </w:rPr>
+      </w:pPr>
+      <w:r>
+        <w:rPr>
+          <w:rFonts w:ascii="Calibri" w:eastAsia="Aptos" w:hAnsi="Calibri" w:cs="Calibri"/>
+          <w:kern w:val="2"/>
+          <w:sz w:val="24"/>
+          <w:szCs w:val="24"/>
+          <w:lang w:val="en-US" w:eastAsia="en-US"/>
+        </w:rPr>
+        <w:br/>
+        <w:t xml:space="preserve">Computer Programming </w:t>
+      </w:r>
+    </w:p>
+    <w:p>
+      <w:pPr>
+        <w:spacing w:after="160" w:line="276" w:lineRule="auto"/>
+        <w:jc w:val="center"/>
+        <w:rPr>
+          <w:rFonts w:ascii="Calibri" w:eastAsia="Aptos" w:hAnsi="Calibri" w:cs="Calibri"/>
+          <w:kern w:val="2"/>
+          <w:sz w:val="24"/>
+          <w:szCs w:val="24"/>
+          <w:lang w:val="en-US" w:eastAsia="en-US"/>
+        </w:rPr>
+      </w:pPr>
+      <w:r>
+        <w:rPr>
+          <w:rFonts w:ascii="Calibri" w:eastAsia="Aptos" w:hAnsi="Calibri" w:cs="Calibri"/>
+          <w:kern w:val="2"/>
+          <w:sz w:val="24"/>
+          <w:szCs w:val="24"/>
+          <w:lang w:val="en-US" w:eastAsia="en-US"/>
+        </w:rPr>
+        <w:t>Algonquin College</w:t>
+      </w:r>
+    </w:p>
+    <w:p>
+      <w:pPr>
+        <w:spacing w:after="160" w:line="276" w:lineRule="auto"/>
+        <w:jc w:val="center"/>
+        <w:rPr>
+          <w:rFonts w:ascii="Calibri" w:eastAsia="Aptos" w:hAnsi="Calibri" w:cs="Calibri"/>
+          <w:kern w:val="2"/>
+          <w:sz w:val="24"/>
+          <w:szCs w:val="24"/>
+          <w:lang w:val="en-US" w:eastAsia="en-US"/>
+        </w:rPr>
+      </w:pPr>
+    </w:p>
+    <w:p>
+      <w:pPr>
+        <w:spacing w:after="160" w:line="276" w:lineRule="auto"/>
+        <w:jc w:val="center"/>
+        <w:rPr>
+          <w:rFonts w:ascii="Calibri" w:eastAsia="Aptos" w:hAnsi="Calibri" w:cs="Calibri"/>
+          <w:kern w:val="2"/>
+          <w:sz w:val="24"/>
+          <w:szCs w:val="24"/>
+          <w:lang w:val="en-US" w:eastAsia="en-US"/>
+        </w:rPr>
+      </w:pPr>
+    </w:p>
+    <w:p>
+      <w:pPr>
+        <w:spacing w:after="160" w:line="276" w:lineRule="auto"/>
+        <w:jc w:val="center"/>
+        <w:rPr>
+          <w:rFonts w:ascii="Calibri" w:eastAsia="Aptos" w:hAnsi="Calibri" w:cs="Calibri"/>
+          <w:kern w:val="2"/>
+          <w:sz w:val="24"/>
+          <w:szCs w:val="24"/>
+          <w:lang w:val="en-US" w:eastAsia="en-US"/>
+        </w:rPr>
+      </w:pPr>
+      <w:r>
+        <w:rPr>
+          <w:rFonts w:ascii="Calibri" w:eastAsia="Aptos" w:hAnsi="Calibri" w:cs="Calibri"/>
+          <w:kern w:val="2"/>
+          <w:sz w:val="24"/>
+          <w:szCs w:val="24"/>
+          <w:lang w:val="en-US" w:eastAsia="en-US"/>
+        </w:rPr>
+        <w:br/>
+      </w:r>
+      <w:r>
+        <w:rPr>
+          <w:rFonts w:ascii="Calibri" w:eastAsia="Aptos" w:hAnsi="Calibri" w:cs="Calibri"/>
+          <w:kern w:val="2"/>
+          <w:sz w:val="24"/>
+          <w:szCs w:val="24"/>
+          <w:lang w:val="en-US" w:eastAsia="en-US"/>
+        </w:rPr>
+        <w:t xml:space="preserve">Sep </w:t>
+      </w:r>
+      <w:r>
+        <w:rPr>
+          <w:rFonts w:ascii="Calibri" w:eastAsia="Aptos" w:hAnsi="Calibri" w:cs="Calibri"/>
+          <w:kern w:val="2"/>
+          <w:sz w:val="24"/>
+          <w:szCs w:val="24"/>
+          <w:lang w:val="en-US" w:eastAsia="en-US"/>
+        </w:rPr>
+        <w:t>25</w:t>
+      </w:r>
+      <w:r>
+        <w:rPr>
+          <w:rFonts w:ascii="Calibri" w:eastAsia="Aptos" w:hAnsi="Calibri" w:cs="Calibri"/>
+          <w:kern w:val="2"/>
+          <w:sz w:val="24"/>
+          <w:szCs w:val="24"/>
+          <w:lang w:val="en-US" w:eastAsia="en-US"/>
+        </w:rPr>
+        <w:t>, 2026</w:t>
+      </w:r>
+    </w:p>
+    <w:p/>
+    <w:p/>
+    <w:p/>
+    <w:p/>
+    <w:p/>
+    <w:p/>
+    <w:p/>
+    <w:p/>
+    <w:p/>
+    <w:p/>
+    <w:p/>
+    <w:p/>
+    <w:p/>
+    <w:p/>
+    <w:p/>
+    <w:p/>
+    <w:p/>
+    <w:p/>
+    <w:p>
+      <w:pPr>
+        <w:rPr>
+          <w:b/>
+          <w:bCs/>
+          <w:sz w:val="38"/>
+          <w:szCs w:val="38"/>
+        </w:rPr>
+      </w:pPr>
+      <w:r>
+        <w:rPr>
+          <w:b/>
+          <w:bCs/>
+          <w:sz w:val="38"/>
+          <w:szCs w:val="38"/>
+          <w:highlight w:val="yellow"/>
+        </w:rPr>
+        <w:lastRenderedPageBreak/>
+        <w:t>Reasoning:</w:t>
+      </w:r>
+    </w:p>
+    <w:p>
+      <w:pPr>
+        <w:rPr>
+          <w:sz w:val="38"/>
+          <w:szCs w:val="38"/>
+        </w:rPr>
+      </w:pPr>
+    </w:p>
+    <w:p>
+      <w:pPr>
+        <w:rPr>
+          <w:sz w:val="38"/>
+          <w:szCs w:val="38"/>
+        </w:rPr>
+      </w:pPr>
+      <w:r>
+        <w:rPr>
+          <w:sz w:val="38"/>
+          <w:szCs w:val="38"/>
+        </w:rPr>
+        <w:t xml:space="preserve">This report is constructed </w:t>
+      </w:r>
+      <w:proofErr w:type="gramStart"/>
+      <w:r>
+        <w:rPr>
+          <w:sz w:val="38"/>
+          <w:szCs w:val="38"/>
+        </w:rPr>
+        <w:t>in order to</w:t>
+      </w:r>
+      <w:proofErr w:type="gramEnd"/>
+      <w:r>
+        <w:rPr>
+          <w:sz w:val="38"/>
+          <w:szCs w:val="38"/>
+        </w:rPr>
+        <w:t xml:space="preserve"> read data from the given excel file</w:t>
+      </w:r>
+      <w:r>
+        <w:rPr>
+          <w:sz w:val="38"/>
+          <w:szCs w:val="38"/>
+        </w:rPr>
+        <w:t xml:space="preserve"> from the </w:t>
+      </w:r>
+      <w:proofErr w:type="spellStart"/>
+      <w:r>
+        <w:rPr>
+          <w:sz w:val="38"/>
+          <w:szCs w:val="38"/>
+        </w:rPr>
+        <w:t>vulnut</w:t>
+      </w:r>
+      <w:proofErr w:type="spellEnd"/>
+      <w:r>
+        <w:rPr>
+          <w:sz w:val="38"/>
+          <w:szCs w:val="38"/>
+        </w:rPr>
+        <w:t xml:space="preserve"> NP dataset. It puts each row in a </w:t>
+      </w:r>
+      <w:proofErr w:type="spellStart"/>
+      <w:r>
+        <w:rPr>
+          <w:sz w:val="38"/>
+          <w:szCs w:val="38"/>
+        </w:rPr>
+        <w:t>lakerecord</w:t>
+      </w:r>
+      <w:proofErr w:type="spellEnd"/>
+      <w:r>
+        <w:rPr>
+          <w:sz w:val="38"/>
+          <w:szCs w:val="38"/>
+        </w:rPr>
+        <w:t xml:space="preserve"> and projects each object to the console.</w:t>
+      </w:r>
+    </w:p>
+    <w:p>
+      <w:pPr>
+        <w:rPr>
+          <w:sz w:val="38"/>
+          <w:szCs w:val="38"/>
+        </w:rPr>
+      </w:pPr>
+    </w:p>
+    <w:p>
+      <w:pPr>
+        <w:rPr>
+          <w:sz w:val="38"/>
+          <w:szCs w:val="38"/>
+        </w:rPr>
+      </w:pPr>
+    </w:p>
+    <w:p>
+      <w:pPr>
+        <w:rPr>
+          <w:b/>
+          <w:bCs/>
+          <w:sz w:val="38"/>
+          <w:szCs w:val="38"/>
+        </w:rPr>
+      </w:pPr>
+      <w:r>
+        <w:rPr>
+          <w:b/>
+          <w:bCs/>
+          <w:sz w:val="38"/>
+          <w:szCs w:val="38"/>
+          <w:highlight w:val="yellow"/>
+        </w:rPr>
+        <w:t>Dataset and record object:</w:t>
+      </w:r>
+    </w:p>
+    <w:p>
+      <w:pPr>
+        <w:rPr>
+          <w:sz w:val="38"/>
+          <w:szCs w:val="38"/>
+        </w:rPr>
+      </w:pPr>
+    </w:p>
+    <w:p>
+      <w:pPr>
+        <w:rPr>
+          <w:sz w:val="38"/>
+          <w:szCs w:val="38"/>
+        </w:rPr>
+      </w:pPr>
+      <w:r>
+        <w:rPr>
+          <w:sz w:val="38"/>
+          <w:szCs w:val="38"/>
+        </w:rPr>
+        <w:t xml:space="preserve">The columns that  the dataset contains are </w:t>
+      </w:r>
+      <w:proofErr w:type="spellStart"/>
+      <w:r>
+        <w:rPr>
+          <w:sz w:val="38"/>
+          <w:szCs w:val="38"/>
+        </w:rPr>
+        <w:t>LakeIdentification</w:t>
+      </w:r>
+      <w:proofErr w:type="spellEnd"/>
+      <w:r>
+        <w:rPr>
+          <w:sz w:val="38"/>
+          <w:szCs w:val="38"/>
+        </w:rPr>
+        <w:t xml:space="preserve">, ID, Year, Species and species code and percent abundance. My </w:t>
+      </w:r>
+      <w:proofErr w:type="spellStart"/>
+      <w:r>
+        <w:rPr>
+          <w:sz w:val="38"/>
+          <w:szCs w:val="38"/>
+        </w:rPr>
+        <w:t>lakerecord</w:t>
+      </w:r>
+      <w:proofErr w:type="spellEnd"/>
+      <w:r>
+        <w:rPr>
+          <w:sz w:val="38"/>
+          <w:szCs w:val="38"/>
+        </w:rPr>
+        <w:t xml:space="preserve"> class is present in a separate file (record.py rather than main.py). It contains a log of different areas of </w:t>
+      </w:r>
+      <w:proofErr w:type="gramStart"/>
+      <w:r>
+        <w:rPr>
+          <w:sz w:val="38"/>
+          <w:szCs w:val="38"/>
+        </w:rPr>
+        <w:t>a</w:t>
+      </w:r>
+      <w:proofErr w:type="gramEnd"/>
+      <w:r>
+        <w:rPr>
+          <w:sz w:val="38"/>
+          <w:szCs w:val="38"/>
+        </w:rPr>
+        <w:t xml:space="preserve"> excel file. </w:t>
+      </w:r>
+    </w:p>
+    <w:p>
+      <w:pPr>
+        <w:rPr>
+          <w:sz w:val="38"/>
+          <w:szCs w:val="38"/>
+        </w:rPr>
+      </w:pPr>
+    </w:p>
+    <w:p>
+      <w:pPr>
+        <w:rPr>
+          <w:sz w:val="38"/>
+          <w:szCs w:val="38"/>
+        </w:rPr>
+      </w:pPr>
+    </w:p>
+    <w:p>
+      <w:pPr>
+        <w:rPr>
+          <w:b/>
+          <w:bCs/>
+          <w:sz w:val="38"/>
+          <w:szCs w:val="38"/>
+        </w:rPr>
+      </w:pPr>
+      <w:r>
+        <w:rPr>
+          <w:b/>
+          <w:bCs/>
+          <w:sz w:val="38"/>
+          <w:szCs w:val="38"/>
+          <w:highlight w:val="yellow"/>
+        </w:rPr>
+        <w:t>Program Layout:</w:t>
+      </w:r>
+      <w:r>
+        <w:rPr>
+          <w:b/>
+          <w:bCs/>
+          <w:sz w:val="38"/>
+          <w:szCs w:val="38"/>
+        </w:rPr>
+        <w:t xml:space="preserve"> </w:t>
+      </w:r>
+    </w:p>
+    <w:p>
+      <w:pPr>
+        <w:rPr>
+          <w:b/>
+          <w:bCs/>
+          <w:sz w:val="38"/>
+          <w:szCs w:val="38"/>
+        </w:rPr>
+      </w:pPr>
+    </w:p>
+    <w:p>
+      <w:pPr>
+        <w:rPr>
+          <w:sz w:val="38"/>
+          <w:szCs w:val="38"/>
+        </w:rPr>
+      </w:pPr>
+      <w:proofErr w:type="spellStart"/>
+      <w:r>
+        <w:rPr>
+          <w:sz w:val="38"/>
+          <w:szCs w:val="38"/>
+        </w:rPr>
+        <w:t>Recordobject</w:t>
+      </w:r>
+      <w:proofErr w:type="spellEnd"/>
+      <w:r>
+        <w:rPr>
+          <w:sz w:val="38"/>
+          <w:szCs w:val="38"/>
+        </w:rPr>
+        <w:t xml:space="preserve"> is in a different file than the main code </w:t>
+      </w:r>
+      <w:proofErr w:type="spellStart"/>
+      <w:r>
+        <w:rPr>
+          <w:sz w:val="38"/>
+          <w:szCs w:val="38"/>
+        </w:rPr>
+        <w:t>LakeRecord</w:t>
+      </w:r>
+      <w:proofErr w:type="spellEnd"/>
+      <w:r>
+        <w:rPr>
+          <w:sz w:val="38"/>
+          <w:szCs w:val="38"/>
+        </w:rPr>
+        <w:t xml:space="preserve"> is in Record.py</w:t>
+      </w:r>
+    </w:p>
+    <w:p>
+      <w:pPr>
+        <w:rPr>
+          <w:sz w:val="38"/>
+          <w:szCs w:val="38"/>
+        </w:rPr>
+      </w:pPr>
+    </w:p>
+    <w:p>
+      <w:pPr>
+        <w:rPr>
+          <w:sz w:val="38"/>
+          <w:szCs w:val="38"/>
+        </w:rPr>
+      </w:pPr>
+      <w:r>
+        <w:rPr>
+          <w:sz w:val="38"/>
+          <w:szCs w:val="38"/>
+        </w:rPr>
+        <w:t xml:space="preserve">File I/O is in open() in </w:t>
+      </w:r>
+      <w:proofErr w:type="spellStart"/>
+      <w:r>
+        <w:rPr>
+          <w:sz w:val="38"/>
+          <w:szCs w:val="38"/>
+        </w:rPr>
+        <w:t>loadRecords</w:t>
+      </w:r>
+      <w:proofErr w:type="spellEnd"/>
+    </w:p>
+    <w:p>
+      <w:pPr>
+        <w:rPr>
+          <w:sz w:val="38"/>
+          <w:szCs w:val="38"/>
+        </w:rPr>
+      </w:pPr>
+    </w:p>
+    <w:p>
+      <w:pPr>
+        <w:rPr>
+          <w:sz w:val="38"/>
+          <w:szCs w:val="38"/>
+        </w:rPr>
+      </w:pPr>
+      <w:r>
+        <w:rPr>
+          <w:sz w:val="38"/>
+          <w:szCs w:val="38"/>
+        </w:rPr>
+        <w:t>Library comes from the CSV file</w:t>
+      </w:r>
+    </w:p>
+    <w:p>
+      <w:pPr>
+        <w:rPr>
+          <w:sz w:val="38"/>
+          <w:szCs w:val="38"/>
+        </w:rPr>
+      </w:pPr>
+    </w:p>
+    <w:p>
+      <w:pPr>
+        <w:rPr>
+          <w:sz w:val="38"/>
+          <w:szCs w:val="38"/>
+        </w:rPr>
+      </w:pPr>
+      <w:r>
+        <w:rPr>
+          <w:sz w:val="38"/>
+          <w:szCs w:val="38"/>
+        </w:rPr>
+        <w:t>Record stores all objects</w:t>
+      </w:r>
+    </w:p>
+    <w:p>
+      <w:pPr>
+        <w:rPr>
+          <w:sz w:val="38"/>
+          <w:szCs w:val="38"/>
+        </w:rPr>
+      </w:pPr>
+    </w:p>
+    <w:p>
+      <w:pPr>
+        <w:rPr>
+          <w:sz w:val="38"/>
+          <w:szCs w:val="38"/>
+        </w:rPr>
+      </w:pPr>
+      <w:r>
+        <w:rPr>
+          <w:sz w:val="38"/>
+          <w:szCs w:val="38"/>
+        </w:rPr>
+        <w:t xml:space="preserve">Loop reads rows ,then moves onto the next and displays it </w:t>
+      </w:r>
+    </w:p>
+    <w:p>
+      <w:pPr>
+        <w:rPr>
+          <w:sz w:val="38"/>
+          <w:szCs w:val="38"/>
+        </w:rPr>
+      </w:pPr>
+      <w:r>
+        <w:rPr>
+          <w:sz w:val="38"/>
+          <w:szCs w:val="38"/>
+        </w:rPr>
+        <w:t>Methods</w:t>
+      </w:r>
+      <w:r>
+        <w:rPr>
+          <w:sz w:val="38"/>
+          <w:szCs w:val="38"/>
+        </w:rPr>
+        <w:t xml:space="preserve"> </w:t>
+      </w:r>
+      <w:r>
+        <w:rPr>
+          <w:sz w:val="38"/>
+          <w:szCs w:val="38"/>
+        </w:rPr>
+        <w:t>__</w:t>
+      </w:r>
+      <w:proofErr w:type="spellStart"/>
+      <w:r>
+        <w:rPr>
+          <w:sz w:val="38"/>
+          <w:szCs w:val="38"/>
+        </w:rPr>
+        <w:t>init</w:t>
+      </w:r>
+      <w:proofErr w:type="spellEnd"/>
+      <w:r>
+        <w:rPr>
+          <w:sz w:val="38"/>
+          <w:szCs w:val="38"/>
+        </w:rPr>
+        <w:t xml:space="preserve">__(), display(), </w:t>
+      </w:r>
+      <w:proofErr w:type="spellStart"/>
+      <w:r>
+        <w:rPr>
+          <w:sz w:val="38"/>
+          <w:szCs w:val="38"/>
+        </w:rPr>
+        <w:t>load_records</w:t>
+      </w:r>
+      <w:proofErr w:type="spellEnd"/>
+      <w:r>
+        <w:rPr>
+          <w:sz w:val="38"/>
+          <w:szCs w:val="38"/>
+        </w:rPr>
+        <w:t>(), and main()</w:t>
+      </w:r>
+    </w:p>
+    <w:p>
+      <w:pPr>
+        <w:rPr>
+          <w:sz w:val="38"/>
+          <w:szCs w:val="38"/>
+        </w:rPr>
+      </w:pPr>
+    </w:p>
+    <w:p>
+      <w:pPr>
+        <w:rPr>
+          <w:sz w:val="38"/>
+          <w:szCs w:val="38"/>
+        </w:rPr>
+      </w:pPr>
+      <w:r>
+        <w:rPr>
+          <w:sz w:val="38"/>
+          <w:szCs w:val="38"/>
+        </w:rPr>
+        <w:t xml:space="preserve">Exception handling is </w:t>
+      </w:r>
+      <w:proofErr w:type="spellStart"/>
+      <w:r>
+        <w:rPr>
+          <w:sz w:val="38"/>
+          <w:szCs w:val="38"/>
+        </w:rPr>
+        <w:t>FileNotFoundError</w:t>
+      </w:r>
+      <w:proofErr w:type="spellEnd"/>
+      <w:r>
+        <w:rPr>
+          <w:sz w:val="38"/>
+          <w:szCs w:val="38"/>
+        </w:rPr>
+        <w:t xml:space="preserve"> and </w:t>
+      </w:r>
+      <w:proofErr w:type="spellStart"/>
+      <w:r>
+        <w:rPr>
+          <w:sz w:val="38"/>
+          <w:szCs w:val="38"/>
+        </w:rPr>
+        <w:t>OSError</w:t>
+      </w:r>
+      <w:proofErr w:type="spellEnd"/>
+      <w:r>
+        <w:rPr>
+          <w:sz w:val="38"/>
+          <w:szCs w:val="38"/>
+        </w:rPr>
+        <w:t xml:space="preserve"> handlers </w:t>
+      </w:r>
+    </w:p>
+    <w:p>
+      <w:pPr>
+        <w:rPr>
+          <w:sz w:val="38"/>
+          <w:szCs w:val="38"/>
+        </w:rPr>
+      </w:pPr>
+    </w:p>
+    <w:p>
+      <w:pPr>
+        <w:rPr>
+          <w:sz w:val="38"/>
+          <w:szCs w:val="38"/>
+        </w:rPr>
+      </w:pPr>
+      <w:r>
+        <w:rPr>
+          <w:sz w:val="38"/>
+          <w:szCs w:val="38"/>
+        </w:rPr>
+        <w:t>Name is always available at the top of the program.</w:t>
+      </w:r>
+    </w:p>
+    <w:p>
+      <w:pPr>
+        <w:rPr>
+          <w:sz w:val="38"/>
+          <w:szCs w:val="38"/>
+        </w:rPr>
+      </w:pPr>
+    </w:p>
+    <w:p>
+      <w:pPr>
+        <w:rPr>
+          <w:b/>
+          <w:bCs/>
+          <w:sz w:val="38"/>
+          <w:szCs w:val="38"/>
+        </w:rPr>
+      </w:pPr>
+      <w:r>
+        <w:rPr>
+          <w:b/>
+          <w:bCs/>
+          <w:sz w:val="38"/>
+          <w:szCs w:val="38"/>
+          <w:highlight w:val="yellow"/>
+        </w:rPr>
+        <w:t>Program Demo:</w:t>
+      </w:r>
+    </w:p>
+    <w:p>
+      <w:pPr>
+        <w:rPr>
+          <w:b/>
+          <w:bCs/>
+          <w:sz w:val="38"/>
+          <w:szCs w:val="38"/>
+        </w:rPr>
+      </w:pPr>
+    </w:p>
+    <w:p>
+      <w:pPr>
+        <w:rPr>
+          <w:b/>
+          <w:bCs/>
+          <w:sz w:val="38"/>
+          <w:szCs w:val="38"/>
+        </w:rPr>
+      </w:pPr>
+      <w:r>
+        <w:rPr>
+          <w:b/>
+          <w:bCs/>
+          <w:noProof/>
+          <w:sz w:val="38"/>
+          <w:szCs w:val="38"/>
+        </w:rPr>
+        <w:drawing>
+          <wp:inline distT="0" distB="0" distL="0" distR="0" wp14:anchorId="1EC655CD" wp14:editId="5038A639">
+            <wp:extent cx="5943600" cy="3524885"/>
+            <wp:effectExtent l="0" t="0" r="0" b="0"/>
+            <wp:docPr id="1235229642" name="Picture 1"/>
+            <wp:cNvGraphicFramePr>
+              <a:graphicFrameLocks xmlns:a="http://schemas.openxmlformats.org/drawingml/2006/main" noChangeAspect="1"/>
+            </wp:cNvGraphicFramePr>
+            <a:graphic xmlns:a="http://schemas.openxmlformats.org/drawingml/2006/main">
+              <a:graphicData uri="http://schemas.openxmlformats.org/drawingml/2006/picture">
+                <pic:pic xmlns:pic="http://schemas.openxmlformats.org/drawingml/2006/picture">
+                  <pic:nvPicPr>
+                    <pic:cNvPr id="1235229642" name="Picture 1235229642"/>
+                    <pic:cNvPicPr/>
+                  </pic:nvPicPr>
+                  <pic:blipFill>
+                    <a:blip r:embed="rId4" cstate="print">
+                      <a:extLst>
+                        <a:ext uri="{28A0092B-C50C-407E-A947-70E740481C1C}">
+                          <a14:useLocalDpi xmlns:a14="http://schemas.microsoft.com/office/drawing/2010/main" val="0"/>
+                        </a:ext>
+                      </a:extLst>
+                    </a:blip>
+                    <a:stretch>
+                      <a:fillRect/>
+                    </a:stretch>
+                  </pic:blipFill>
+                  <pic:spPr>
+                    <a:xfrm>
+                      <a:off x="0" y="0"/>
+                      <a:ext cx="5943600" cy="3524885"/>
+                    </a:xfrm>
+                    <a:prstGeom prst="rect">
+                      <a:avLst/>
+                    </a:prstGeom>
+                  </pic:spPr>
+                </pic:pic>
+              </a:graphicData>
+            </a:graphic>
+          </wp:inline>
+        </w:drawing>
+      </w:r>
+    </w:p>
+    <w:p>
+      <w:pPr>
+        <w:jc w:val="center"/>
+        <w:rPr>
+          <w:b/>
+          <w:bCs/>
+          <w:sz w:val="22"/>
+          <w:szCs w:val="22"/>
+        </w:rPr>
+      </w:pPr>
+      <w:r>
+        <w:rPr>
+          <w:b/>
+          <w:bCs/>
+          <w:sz w:val="22"/>
+          <w:szCs w:val="22"/>
+        </w:rPr>
+        <w:t>Figure 1.</w:t>
+      </w:r>
+      <w:r>
+        <w:rPr>
+          <w:b/>
+          <w:bCs/>
+          <w:sz w:val="22"/>
+          <w:szCs w:val="22"/>
+        </w:rPr>
+        <w:t xml:space="preserve">  The program displays first 5 data lines of the csv file from the </w:t>
+      </w:r>
+      <w:proofErr w:type="spellStart"/>
+      <w:r>
+        <w:rPr>
+          <w:b/>
+          <w:bCs/>
+          <w:sz w:val="22"/>
+          <w:szCs w:val="22"/>
+        </w:rPr>
+        <w:t>Vulnut</w:t>
+      </w:r>
+      <w:proofErr w:type="spellEnd"/>
+      <w:r>
+        <w:rPr>
+          <w:b/>
+          <w:bCs/>
+          <w:sz w:val="22"/>
+          <w:szCs w:val="22"/>
+        </w:rPr>
+        <w:t xml:space="preserve"> NP dataset</w:t>
+      </w:r>
+    </w:p>
+    <w:p>
+      <w:pPr>
+        <w:jc w:val="center"/>
+        <w:rPr>
+          <w:b/>
+          <w:bCs/>
+          <w:sz w:val="22"/>
+          <w:szCs w:val="22"/>
+        </w:rPr>
+      </w:pPr>
+    </w:p>
+    <w:p>
+      <w:pPr>
+        <w:jc w:val="center"/>
+        <w:rPr>
+          <w:b/>
+          <w:bCs/>
+          <w:sz w:val="22"/>
+          <w:szCs w:val="22"/>
+        </w:rPr>
+      </w:pPr>
+    </w:p>
+    <w:p>
+      <w:pPr>
+        <w:jc w:val="center"/>
+        <w:rPr>
+          <w:b/>
+          <w:bCs/>
+          <w:sz w:val="22"/>
+          <w:szCs w:val="22"/>
+        </w:rPr>
+      </w:pPr>
+      <w:r>
+        <w:rPr>
+          <w:b/>
+          <w:bCs/>
+          <w:sz w:val="22"/>
+          <w:szCs w:val="22"/>
+        </w:rPr>
+        <w:lastRenderedPageBreak/>
+        <w:drawing>
+          <wp:inline distT="0" distB="0" distL="0" distR="0" wp14:anchorId="4233ACC0" wp14:editId="5790D20F">
+            <wp:extent cx="5943600" cy="3714750"/>
+            <wp:effectExtent l="0" t="0" r="0" b="0"/>
+            <wp:docPr id="1954662722" name="Picture 1"/>
+            <wp:cNvGraphicFramePr>
+              <a:graphicFrameLocks xmlns:a="http://schemas.openxmlformats.org/drawingml/2006/main" noChangeAspect="1"/>
+            </wp:cNvGraphicFramePr>
+            <a:graphic xmlns:a="http://schemas.openxmlformats.org/drawingml/2006/main">
+              <a:graphicData uri="http://schemas.openxmlformats.org/drawingml/2006/picture">
+                <pic:pic xmlns:pic="http://schemas.openxmlformats.org/drawingml/2006/picture">
+                  <pic:nvPicPr>
+                    <pic:cNvPr id="1954662722" name=""/>
+                    <pic:cNvPicPr/>
+                  </pic:nvPicPr>
+                  <pic:blipFill>
+                    <a:blip r:embed="rId5"/>
+                    <a:stretch>
+                      <a:fillRect/>
+                    </a:stretch>
+                  </pic:blipFill>
+                  <pic:spPr>
+                    <a:xfrm>
+                      <a:off x="0" y="0"/>
+                      <a:ext cx="5943600" cy="3714750"/>
+                    </a:xfrm>
+                    <a:prstGeom prst="rect">
+                      <a:avLst/>
+                    </a:prstGeom>
+                  </pic:spPr>
+                </pic:pic>
+              </a:graphicData>
+            </a:graphic>
+          </wp:inline>
+        </w:drawing>
+      </w:r>
+    </w:p>
+    <w:p>
+      <w:pPr>
+        <w:jc w:val="center"/>
+        <w:rPr>
+          <w:b/>
+          <w:bCs/>
+          <w:sz w:val="22"/>
+          <w:szCs w:val="22"/>
+        </w:rPr>
+      </w:pPr>
+      <w:r>
+        <w:rPr>
+          <w:b/>
+          <w:bCs/>
+          <w:sz w:val="22"/>
+          <w:szCs w:val="22"/>
+        </w:rPr>
+        <w:t xml:space="preserve">Figure </w:t>
+      </w:r>
+      <w:r>
+        <w:rPr>
+          <w:b/>
+          <w:bCs/>
+          <w:sz w:val="22"/>
+          <w:szCs w:val="22"/>
+        </w:rPr>
+        <w:t>2</w:t>
+      </w:r>
+      <w:r>
+        <w:rPr>
+          <w:b/>
+          <w:bCs/>
+          <w:sz w:val="22"/>
+          <w:szCs w:val="22"/>
+        </w:rPr>
+        <w:t>.</w:t>
+      </w:r>
+      <w:r>
+        <w:rPr>
+          <w:b/>
+          <w:bCs/>
+          <w:sz w:val="22"/>
+          <w:szCs w:val="22"/>
+        </w:rPr>
+        <w:t xml:space="preserve">  </w:t>
+      </w:r>
+      <w:r>
+        <w:rPr>
+          <w:b/>
+          <w:bCs/>
+          <w:sz w:val="22"/>
+          <w:szCs w:val="22"/>
+        </w:rPr>
+        <w:t>Highlights the layout for both files and where they are located on the machine</w:t>
+      </w:r>
+    </w:p>
+    <w:p>
+      <w:pPr>
+        <w:rPr>
+          <w:b/>
+          <w:bCs/>
+          <w:sz w:val="22"/>
+          <w:szCs w:val="22"/>
+        </w:rPr>
+      </w:pPr>
+    </w:p>
+    <w:p>
+      <w:pPr>
+        <w:rPr>
+          <w:b/>
+          <w:bCs/>
+          <w:sz w:val="22"/>
+          <w:szCs w:val="22"/>
+        </w:rPr>
+      </w:pPr>
+    </w:p>
+    <w:p>
+      <w:pPr>
+        <w:rPr>
+          <w:b/>
+          <w:bCs/>
+          <w:sz w:val="22"/>
+          <w:szCs w:val="22"/>
+        </w:rPr>
+      </w:pPr>
+    </w:p>
+    <w:p>
+      <w:pPr>
+        <w:rPr>
+          <w:b/>
+          <w:bCs/>
+          <w:sz w:val="38"/>
+          <w:szCs w:val="38"/>
+        </w:rPr>
+      </w:pPr>
+      <w:r>
+        <w:rPr>
+          <w:b/>
+          <w:bCs/>
+          <w:sz w:val="38"/>
+          <w:szCs w:val="38"/>
+          <w:highlight w:val="yellow"/>
+        </w:rPr>
+        <w:t>Test and</w:t>
+      </w:r>
+      <w:r>
+        <w:rPr>
+          <w:b/>
+          <w:bCs/>
+          <w:sz w:val="38"/>
+          <w:szCs w:val="38"/>
+          <w:highlight w:val="yellow"/>
+        </w:rPr>
+        <w:t xml:space="preserve"> </w:t>
+      </w:r>
+      <w:r>
+        <w:rPr>
+          <w:b/>
+          <w:bCs/>
+          <w:sz w:val="38"/>
+          <w:szCs w:val="38"/>
+          <w:highlight w:val="yellow"/>
+        </w:rPr>
+        <w:t>Overview</w:t>
+      </w:r>
+      <w:r>
+        <w:rPr>
+          <w:b/>
+          <w:bCs/>
+          <w:sz w:val="38"/>
+          <w:szCs w:val="38"/>
+          <w:highlight w:val="yellow"/>
+        </w:rPr>
+        <w:t>:</w:t>
+      </w:r>
+    </w:p>
+    <w:p>
+      <w:pPr>
+        <w:rPr>
+          <w:b/>
+          <w:bCs/>
+          <w:sz w:val="38"/>
+          <w:szCs w:val="38"/>
+        </w:rPr>
+      </w:pPr>
+    </w:p>
+    <w:p>
+      <w:pPr>
+        <w:rPr>
+          <w:sz w:val="38"/>
+          <w:szCs w:val="38"/>
+        </w:rPr>
+      </w:pPr>
+      <w:r>
+        <w:rPr>
+          <w:sz w:val="38"/>
+          <w:szCs w:val="38"/>
+        </w:rPr>
+        <w:t xml:space="preserve">I made sure that all files were in the same folder as the main program. It displayed 5 data lines starting from 99-105. It showed </w:t>
+      </w:r>
+      <w:r>
+        <w:rPr>
+          <w:sz w:val="38"/>
+          <w:szCs w:val="38"/>
+        </w:rPr>
+        <w:t xml:space="preserve">species </w:t>
+      </w:r>
+      <w:r>
+        <w:rPr>
+          <w:sz w:val="38"/>
+          <w:szCs w:val="38"/>
+        </w:rPr>
+        <w:t>and Lake names. I also tried running the program from a different folder and the program displayed an error message.</w:t>
+      </w:r>
+    </w:p>
+    <w:p>
+      <w:pPr>
+        <w:rPr>
+          <w:sz w:val="38"/>
+          <w:szCs w:val="38"/>
+        </w:rPr>
+      </w:pPr>
+    </w:p>
+    <w:p>
+      <w:pPr>
+        <w:rPr>
+          <w:sz w:val="38"/>
+          <w:szCs w:val="38"/>
+        </w:rPr>
+      </w:pPr>
+      <w:r>
+        <w:rPr>
+          <w:sz w:val="38"/>
+          <w:szCs w:val="38"/>
+          <w:highlight w:val="yellow"/>
+        </w:rPr>
+        <w:t>Variables</w:t>
+      </w:r>
+      <w:r>
+        <w:rPr>
+          <w:sz w:val="38"/>
+          <w:szCs w:val="38"/>
+          <w:highlight w:val="yellow"/>
+        </w:rPr>
+        <w:t>:</w:t>
+      </w:r>
+    </w:p>
+    <w:p>
+      <w:pPr>
+        <w:rPr>
+          <w:sz w:val="38"/>
+          <w:szCs w:val="38"/>
+        </w:rPr>
+      </w:pPr>
+      <w:r>
+        <w:rPr>
+          <w:sz w:val="38"/>
+          <w:szCs w:val="38"/>
+        </w:rPr>
+        <w:t>(self,identification,lake_identification,year,species_code,species,percent_abundance):</w:t>
+      </w:r>
+    </w:p>
+    <w:p>
+      <w:pPr>
+        <w:rPr>
+          <w:sz w:val="38"/>
+          <w:szCs w:val="38"/>
+        </w:rPr>
+      </w:pPr>
+    </w:p>
+    <w:p>
+      <w:pPr>
+        <w:rPr>
+          <w:sz w:val="38"/>
+          <w:szCs w:val="38"/>
+        </w:rPr>
+      </w:pPr>
+      <w:r>
+        <w:rPr>
+          <w:sz w:val="38"/>
+          <w:szCs w:val="38"/>
+        </w:rPr>
+        <w:lastRenderedPageBreak/>
+        <w:t>These are the variables used in the main program. This helps dictate what data the user will be looking through. These variables must match data provided in the dataset.</w:t>
+      </w:r>
+    </w:p>
+    <w:p>
+      <w:pPr>
+        <w:rPr>
+          <w:sz w:val="38"/>
+          <w:szCs w:val="38"/>
+        </w:rPr>
+      </w:pPr>
+    </w:p>
+    <w:p>
+      <w:pPr>
+        <w:rPr>
+          <w:sz w:val="38"/>
+          <w:szCs w:val="38"/>
+        </w:rPr>
+      </w:pPr>
+      <w:r>
+        <w:rPr>
+          <w:sz w:val="38"/>
+          <w:szCs w:val="38"/>
+          <w:highlight w:val="yellow"/>
+        </w:rPr>
+        <w:t>Methods</w:t>
+      </w:r>
+      <w:r>
+        <w:rPr>
+          <w:sz w:val="38"/>
+          <w:szCs w:val="38"/>
+          <w:highlight w:val="yellow"/>
+        </w:rPr>
+        <w:t>:</w:t>
+      </w:r>
+    </w:p>
+    <w:p>
+      <w:pPr>
+        <w:rPr>
+          <w:sz w:val="38"/>
+          <w:szCs w:val="38"/>
+        </w:rPr>
+      </w:pPr>
+    </w:p>
+    <w:p>
+      <w:pPr>
+        <w:rPr>
+          <w:sz w:val="38"/>
+          <w:szCs w:val="38"/>
+        </w:rPr>
+      </w:pPr>
+    </w:p>
+    <w:p>
+      <w:pPr>
+        <w:rPr>
+          <w:sz w:val="38"/>
+          <w:szCs w:val="38"/>
+        </w:rPr>
+      </w:pPr>
+      <w:r>
+        <w:rPr>
+          <w:sz w:val="38"/>
+          <w:szCs w:val="38"/>
+        </w:rPr>
+        <w:t>    def display(self):</w:t>
+      </w:r>
+    </w:p>
+    <w:p>
+      <w:pPr>
+        <w:rPr>
+          <w:sz w:val="38"/>
+          <w:szCs w:val="38"/>
+        </w:rPr>
+      </w:pPr>
+      <w:r>
+        <w:rPr>
+          <w:sz w:val="38"/>
+          <w:szCs w:val="38"/>
+        </w:rPr>
+        <w:t>        """Allows data to become more readable and return records fields"""</w:t>
+      </w:r>
+    </w:p>
+    <w:p>
+      <w:pPr>
+        <w:rPr>
+          <w:sz w:val="38"/>
+          <w:szCs w:val="38"/>
+        </w:rPr>
+      </w:pPr>
+      <w:r>
+        <w:rPr>
+          <w:sz w:val="38"/>
+          <w:szCs w:val="38"/>
+        </w:rPr>
+        <w:t>        return (</w:t>
+      </w:r>
+      <w:proofErr w:type="spellStart"/>
+      <w:r>
+        <w:rPr>
+          <w:sz w:val="38"/>
+          <w:szCs w:val="38"/>
+        </w:rPr>
+        <w:t>f"ID</w:t>
+      </w:r>
+      <w:proofErr w:type="spellEnd"/>
+      <w:r>
+        <w:rPr>
+          <w:sz w:val="38"/>
+          <w:szCs w:val="38"/>
+        </w:rPr>
+        <w:t>: {</w:t>
+      </w:r>
+      <w:proofErr w:type="spellStart"/>
+      <w:r>
+        <w:rPr>
+          <w:sz w:val="38"/>
+          <w:szCs w:val="38"/>
+        </w:rPr>
+        <w:t>self.identification</w:t>
+      </w:r>
+      <w:proofErr w:type="spellEnd"/>
+      <w:r>
+        <w:rPr>
+          <w:sz w:val="38"/>
+          <w:szCs w:val="38"/>
+        </w:rPr>
+        <w:t>} | "</w:t>
+      </w:r>
+      <w:proofErr w:type="spellStart"/>
+      <w:r>
+        <w:rPr>
+          <w:sz w:val="38"/>
+          <w:szCs w:val="38"/>
+        </w:rPr>
+        <w:t>f"Lake</w:t>
+      </w:r>
+      <w:proofErr w:type="spellEnd"/>
+      <w:r>
+        <w:rPr>
+          <w:sz w:val="38"/>
+          <w:szCs w:val="38"/>
+        </w:rPr>
+        <w:t>: {</w:t>
+      </w:r>
+      <w:proofErr w:type="spellStart"/>
+      <w:r>
+        <w:rPr>
+          <w:sz w:val="38"/>
+          <w:szCs w:val="38"/>
+        </w:rPr>
+        <w:t>self.lake_identification</w:t>
+      </w:r>
+      <w:proofErr w:type="spellEnd"/>
+      <w:r>
+        <w:rPr>
+          <w:sz w:val="38"/>
+          <w:szCs w:val="38"/>
+        </w:rPr>
+        <w:t>} | "</w:t>
+      </w:r>
+      <w:proofErr w:type="spellStart"/>
+      <w:r>
+        <w:rPr>
+          <w:sz w:val="38"/>
+          <w:szCs w:val="38"/>
+        </w:rPr>
+        <w:t>f"Year</w:t>
+      </w:r>
+      <w:proofErr w:type="spellEnd"/>
+      <w:r>
+        <w:rPr>
+          <w:sz w:val="38"/>
+          <w:szCs w:val="38"/>
+        </w:rPr>
+        <w:t>: {</w:t>
+      </w:r>
+      <w:proofErr w:type="spellStart"/>
+      <w:r>
+        <w:rPr>
+          <w:sz w:val="38"/>
+          <w:szCs w:val="38"/>
+        </w:rPr>
+        <w:t>self.year</w:t>
+      </w:r>
+      <w:proofErr w:type="spellEnd"/>
+      <w:r>
+        <w:rPr>
+          <w:sz w:val="38"/>
+          <w:szCs w:val="38"/>
+        </w:rPr>
+        <w:t>} | "</w:t>
+      </w:r>
+      <w:proofErr w:type="spellStart"/>
+      <w:r>
+        <w:rPr>
+          <w:sz w:val="38"/>
+          <w:szCs w:val="38"/>
+        </w:rPr>
+        <w:t>f"Species</w:t>
+      </w:r>
+      <w:proofErr w:type="spellEnd"/>
+      <w:r>
+        <w:rPr>
+          <w:sz w:val="38"/>
+          <w:szCs w:val="38"/>
+        </w:rPr>
+        <w:t xml:space="preserve"> code: {</w:t>
+      </w:r>
+      <w:proofErr w:type="spellStart"/>
+      <w:r>
+        <w:rPr>
+          <w:sz w:val="38"/>
+          <w:szCs w:val="38"/>
+        </w:rPr>
+        <w:t>self.species_code</w:t>
+      </w:r>
+      <w:proofErr w:type="spellEnd"/>
+      <w:r>
+        <w:rPr>
+          <w:sz w:val="38"/>
+          <w:szCs w:val="38"/>
+        </w:rPr>
+        <w:t>} | "</w:t>
+      </w:r>
+      <w:proofErr w:type="spellStart"/>
+      <w:r>
+        <w:rPr>
+          <w:sz w:val="38"/>
+          <w:szCs w:val="38"/>
+        </w:rPr>
+        <w:t>f"Species</w:t>
+      </w:r>
+      <w:proofErr w:type="spellEnd"/>
+      <w:r>
+        <w:rPr>
+          <w:sz w:val="38"/>
+          <w:szCs w:val="38"/>
+        </w:rPr>
+        <w:t>: {</w:t>
+      </w:r>
+      <w:proofErr w:type="spellStart"/>
+      <w:r>
+        <w:rPr>
+          <w:sz w:val="38"/>
+          <w:szCs w:val="38"/>
+        </w:rPr>
+        <w:t>self.species</w:t>
+      </w:r>
+      <w:proofErr w:type="spellEnd"/>
+      <w:r>
+        <w:rPr>
+          <w:sz w:val="38"/>
+          <w:szCs w:val="38"/>
+        </w:rPr>
+        <w:t>} | "</w:t>
+      </w:r>
+      <w:proofErr w:type="spellStart"/>
+      <w:r>
+        <w:rPr>
+          <w:sz w:val="38"/>
+          <w:szCs w:val="38"/>
+        </w:rPr>
+        <w:t>f"Percent</w:t>
+      </w:r>
+      <w:proofErr w:type="spellEnd"/>
+      <w:r>
+        <w:rPr>
+          <w:sz w:val="38"/>
+          <w:szCs w:val="38"/>
+        </w:rPr>
+        <w:t xml:space="preserve"> abundance: {</w:t>
+      </w:r>
+      <w:proofErr w:type="spellStart"/>
+      <w:r>
+        <w:rPr>
+          <w:sz w:val="38"/>
+          <w:szCs w:val="38"/>
+        </w:rPr>
+        <w:t>self.percent_abundance</w:t>
+      </w:r>
+      <w:proofErr w:type="spellEnd"/>
+      <w:r>
+        <w:rPr>
+          <w:sz w:val="38"/>
+          <w:szCs w:val="38"/>
+        </w:rPr>
+        <w:t>}" )</w:t>
+      </w:r>
+    </w:p>
+    <w:p>
+      <w:pPr>
+        <w:rPr>
+          <w:sz w:val="38"/>
+          <w:szCs w:val="38"/>
+        </w:rPr>
+      </w:pPr>
+    </w:p>
+    <w:p>
+      <w:pPr>
+        <w:rPr>
+          <w:sz w:val="38"/>
+          <w:szCs w:val="38"/>
+        </w:rPr>
+      </w:pPr>
+      <w:r>
+        <w:rPr>
+          <w:sz w:val="38"/>
+          <w:szCs w:val="38"/>
+        </w:rPr>
+        <w:t>This method is used to take in respected data from the dataset, then display them in a block sized table.  This method has a return and takes in one parameter</w:t>
+      </w:r>
+    </w:p>
+    <w:p>
+      <w:pPr>
+        <w:rPr>
+          <w:sz w:val="38"/>
+          <w:szCs w:val="38"/>
+        </w:rPr>
+      </w:pPr>
+    </w:p>
+    <w:p>
+      <w:pPr>
+        <w:rPr>
+          <w:sz w:val="38"/>
+          <w:szCs w:val="38"/>
+        </w:rPr>
+      </w:pPr>
+    </w:p>
+    <w:p>
+      <w:pPr>
+        <w:rPr>
+          <w:sz w:val="38"/>
+          <w:szCs w:val="38"/>
+        </w:rPr>
+      </w:pPr>
+      <w:r>
+        <w:rPr>
+          <w:sz w:val="38"/>
+          <w:szCs w:val="38"/>
+          <w:highlight w:val="yellow"/>
+        </w:rPr>
+        <w:t>Loops</w:t>
+      </w:r>
+      <w:r>
+        <w:rPr>
+          <w:sz w:val="38"/>
+          <w:szCs w:val="38"/>
+          <w:highlight w:val="yellow"/>
+        </w:rPr>
+        <w:t>:</w:t>
+      </w:r>
+    </w:p>
+    <w:p>
+      <w:pPr>
+        <w:rPr>
+          <w:sz w:val="38"/>
+          <w:szCs w:val="38"/>
+        </w:rPr>
+      </w:pPr>
+    </w:p>
+    <w:p>
+      <w:pPr>
+        <w:rPr>
+          <w:sz w:val="38"/>
+          <w:szCs w:val="38"/>
+        </w:rPr>
+      </w:pPr>
+      <w:r>
+        <w:rPr>
+          <w:sz w:val="38"/>
+          <w:szCs w:val="38"/>
+        </w:rPr>
+        <w:t>    for record in records:</w:t>
+      </w:r>
+    </w:p>
+    <w:p>
+      <w:pPr>
+        <w:rPr>
+          <w:sz w:val="38"/>
+          <w:szCs w:val="38"/>
+        </w:rPr>
+      </w:pPr>
+      <w:r>
+        <w:rPr>
+          <w:sz w:val="38"/>
+          <w:szCs w:val="38"/>
+        </w:rPr>
+        <w:t>        print(</w:t>
+      </w:r>
+      <w:proofErr w:type="spellStart"/>
+      <w:r>
+        <w:rPr>
+          <w:sz w:val="38"/>
+          <w:szCs w:val="38"/>
+        </w:rPr>
+        <w:t>record.display</w:t>
+      </w:r>
+      <w:proofErr w:type="spellEnd"/>
+      <w:r>
+        <w:rPr>
+          <w:sz w:val="38"/>
+          <w:szCs w:val="38"/>
+        </w:rPr>
+        <w:t>())</w:t>
+      </w:r>
+    </w:p>
+    <w:p>
+      <w:pPr>
+        <w:rPr>
+          <w:sz w:val="38"/>
+          <w:szCs w:val="38"/>
+        </w:rPr>
+      </w:pPr>
+    </w:p>
+    <w:p>
+      <w:pPr>
+        <w:rPr>
+          <w:sz w:val="38"/>
+          <w:szCs w:val="38"/>
+        </w:rPr>
+      </w:pPr>
+      <w:r>
+        <w:rPr>
+          <w:sz w:val="38"/>
+          <w:szCs w:val="38"/>
+        </w:rPr>
+        <w:t>This loop looks through a record in the records array and displays all record. In this case, we have  5 records from the respected data set.</w:t>
+      </w:r>
+    </w:p>
+    <w:p>
+      <w:pPr>
+        <w:rPr>
+          <w:sz w:val="38"/>
+          <w:szCs w:val="38"/>
+        </w:rPr>
+      </w:pPr>
+    </w:p>
+    <w:p>
+      <w:pPr>
+        <w:rPr>
+          <w:sz w:val="38"/>
+          <w:szCs w:val="38"/>
+        </w:rPr>
+      </w:pPr>
+      <w:r>
+        <w:rPr>
+          <w:sz w:val="38"/>
+          <w:szCs w:val="38"/>
+          <w:highlight w:val="yellow"/>
+        </w:rPr>
+        <w:lastRenderedPageBreak/>
+        <w:t>File I/O</w:t>
+      </w:r>
+      <w:r>
+        <w:rPr>
+          <w:sz w:val="38"/>
+          <w:szCs w:val="38"/>
+          <w:highlight w:val="yellow"/>
+        </w:rPr>
+        <w:t>:</w:t>
+      </w:r>
+    </w:p>
+    <w:p>
+      <w:pPr>
+        <w:rPr>
+          <w:sz w:val="38"/>
+          <w:szCs w:val="38"/>
+        </w:rPr>
+      </w:pPr>
+    </w:p>
+    <w:p>
+      <w:pPr>
+        <w:rPr>
+          <w:sz w:val="38"/>
+          <w:szCs w:val="38"/>
+        </w:rPr>
+      </w:pPr>
+      <w:r>
+        <w:rPr>
+          <w:sz w:val="38"/>
+          <w:szCs w:val="38"/>
+        </w:rPr>
+        <w:t>with open(filename, "r", encoding="cp1252", newline="") as file:</w:t>
+      </w:r>
+    </w:p>
+    <w:p>
+      <w:pPr>
+        <w:rPr>
+          <w:sz w:val="38"/>
+          <w:szCs w:val="38"/>
+        </w:rPr>
+      </w:pPr>
+      <w:r>
+        <w:rPr>
+          <w:sz w:val="38"/>
+          <w:szCs w:val="38"/>
+        </w:rPr>
+        <w:t xml:space="preserve">        reader = </w:t>
+      </w:r>
+      <w:proofErr w:type="spellStart"/>
+      <w:r>
+        <w:rPr>
+          <w:sz w:val="38"/>
+          <w:szCs w:val="38"/>
+        </w:rPr>
+        <w:t>csv.DictReader</w:t>
+      </w:r>
+      <w:proofErr w:type="spellEnd"/>
+      <w:r>
+        <w:rPr>
+          <w:sz w:val="38"/>
+          <w:szCs w:val="38"/>
+        </w:rPr>
+        <w:t>(file)</w:t>
+      </w:r>
+    </w:p>
+    <w:p>
+      <w:pPr>
+        <w:rPr>
+          <w:sz w:val="38"/>
+          <w:szCs w:val="38"/>
+        </w:rPr>
+      </w:pPr>
+    </w:p>
+    <w:p>
+      <w:pPr>
+        <w:rPr>
+          <w:sz w:val="38"/>
+          <w:szCs w:val="38"/>
+        </w:rPr>
+      </w:pPr>
+      <w:r>
+        <w:rPr>
+          <w:sz w:val="38"/>
+          <w:szCs w:val="38"/>
+        </w:rPr>
+        <w:t>        next(reader, None)</w:t>
+      </w:r>
+    </w:p>
+    <w:p>
+      <w:pPr>
+        <w:rPr>
+          <w:sz w:val="38"/>
+          <w:szCs w:val="38"/>
+        </w:rPr>
+      </w:pPr>
+    </w:p>
+    <w:p>
+      <w:pPr>
+        <w:rPr>
+          <w:sz w:val="38"/>
+          <w:szCs w:val="38"/>
+        </w:rPr>
+      </w:pPr>
+      <w:r>
+        <w:rPr>
+          <w:sz w:val="38"/>
+          <w:szCs w:val="38"/>
+          <w:highlight w:val="yellow"/>
+        </w:rPr>
+        <w:t>Exception handling</w:t>
+      </w:r>
+      <w:r>
+        <w:rPr>
+          <w:sz w:val="38"/>
+          <w:szCs w:val="38"/>
+          <w:highlight w:val="yellow"/>
+        </w:rPr>
+        <w:t>:</w:t>
+      </w:r>
+    </w:p>
+    <w:p>
+      <w:pPr>
+        <w:rPr>
+          <w:sz w:val="38"/>
+          <w:szCs w:val="38"/>
+        </w:rPr>
+      </w:pPr>
+    </w:p>
+    <w:p>
+      <w:pPr>
+        <w:rPr>
+          <w:sz w:val="38"/>
+          <w:szCs w:val="38"/>
+        </w:rPr>
+      </w:pPr>
+      <w:r>
+        <w:rPr>
+          <w:sz w:val="38"/>
+          <w:szCs w:val="38"/>
+        </w:rPr>
+        <w:t>    try:</w:t>
+      </w:r>
+    </w:p>
+    <w:p>
+      <w:pPr>
+        <w:rPr>
+          <w:sz w:val="38"/>
+          <w:szCs w:val="38"/>
+        </w:rPr>
+      </w:pPr>
+      <w:r>
+        <w:rPr>
+          <w:sz w:val="38"/>
+          <w:szCs w:val="38"/>
+        </w:rPr>
+        <w:t xml:space="preserve">        records = </w:t>
+      </w:r>
+      <w:proofErr w:type="spellStart"/>
+      <w:r>
+        <w:rPr>
+          <w:sz w:val="38"/>
+          <w:szCs w:val="38"/>
+        </w:rPr>
+        <w:t>load_records</w:t>
+      </w:r>
+      <w:proofErr w:type="spellEnd"/>
+      <w:r>
+        <w:rPr>
+          <w:sz w:val="38"/>
+          <w:szCs w:val="38"/>
+        </w:rPr>
+        <w:t>(CSV_FILE, NUMBER_OF_RECORDS)</w:t>
+      </w:r>
+    </w:p>
+    <w:p>
+      <w:pPr>
+        <w:rPr>
+          <w:sz w:val="38"/>
+          <w:szCs w:val="38"/>
+        </w:rPr>
+      </w:pPr>
+      <w:r>
+        <w:rPr>
+          <w:sz w:val="38"/>
+          <w:szCs w:val="38"/>
+        </w:rPr>
+        <w:t xml:space="preserve">    except </w:t>
+      </w:r>
+      <w:proofErr w:type="spellStart"/>
+      <w:r>
+        <w:rPr>
+          <w:sz w:val="38"/>
+          <w:szCs w:val="38"/>
+        </w:rPr>
+        <w:t>FileNotFoundError</w:t>
+      </w:r>
+      <w:proofErr w:type="spellEnd"/>
+      <w:r>
+        <w:rPr>
+          <w:sz w:val="38"/>
+          <w:szCs w:val="38"/>
+        </w:rPr>
+        <w:t>:</w:t>
+      </w:r>
+    </w:p>
+    <w:p>
+      <w:pPr>
+        <w:rPr>
+          <w:sz w:val="38"/>
+          <w:szCs w:val="38"/>
+        </w:rPr>
+      </w:pPr>
+      <w:r>
+        <w:rPr>
+          <w:sz w:val="38"/>
+          <w:szCs w:val="38"/>
+        </w:rPr>
+        <w:t>        print(</w:t>
+      </w:r>
+      <w:proofErr w:type="spellStart"/>
+      <w:r>
+        <w:rPr>
+          <w:sz w:val="38"/>
+          <w:szCs w:val="38"/>
+        </w:rPr>
+        <w:t>f"Error</w:t>
+      </w:r>
+      <w:proofErr w:type="spellEnd"/>
+      <w:r>
+        <w:rPr>
+          <w:sz w:val="38"/>
+          <w:szCs w:val="38"/>
+        </w:rPr>
+        <w:t>: Could not find '{CSV_FILE}'.")</w:t>
+      </w:r>
+    </w:p>
+    <w:p>
+      <w:pPr>
+        <w:rPr>
+          <w:sz w:val="38"/>
+          <w:szCs w:val="38"/>
+        </w:rPr>
+      </w:pPr>
+      <w:r>
+        <w:rPr>
+          <w:sz w:val="38"/>
+          <w:szCs w:val="38"/>
+        </w:rPr>
+        <w:t>        return</w:t>
+      </w:r>
+    </w:p>
+    <w:p>
+      <w:pPr>
+        <w:rPr>
+          <w:sz w:val="38"/>
+          <w:szCs w:val="38"/>
+        </w:rPr>
+      </w:pPr>
+      <w:r>
+        <w:rPr>
+          <w:sz w:val="38"/>
+          <w:szCs w:val="38"/>
+        </w:rPr>
+        <w:t xml:space="preserve">    except </w:t>
+      </w:r>
+      <w:proofErr w:type="spellStart"/>
+      <w:r>
+        <w:rPr>
+          <w:sz w:val="38"/>
+          <w:szCs w:val="38"/>
+        </w:rPr>
+        <w:t>OSError</w:t>
+      </w:r>
+      <w:proofErr w:type="spellEnd"/>
+      <w:r>
+        <w:rPr>
+          <w:sz w:val="38"/>
+          <w:szCs w:val="38"/>
+        </w:rPr>
+        <w:t xml:space="preserve"> as error:</w:t>
+      </w:r>
+    </w:p>
+    <w:p>
+      <w:pPr>
+        <w:rPr>
+          <w:sz w:val="38"/>
+          <w:szCs w:val="38"/>
+        </w:rPr>
+      </w:pPr>
+      <w:r>
+        <w:rPr>
+          <w:sz w:val="38"/>
+          <w:szCs w:val="38"/>
+        </w:rPr>
+        <w:t>        print(</w:t>
+      </w:r>
+      <w:proofErr w:type="spellStart"/>
+      <w:r>
+        <w:rPr>
+          <w:sz w:val="38"/>
+          <w:szCs w:val="38"/>
+        </w:rPr>
+        <w:t>f"Error</w:t>
+      </w:r>
+      <w:proofErr w:type="spellEnd"/>
+      <w:r>
+        <w:rPr>
+          <w:sz w:val="38"/>
+          <w:szCs w:val="38"/>
+        </w:rPr>
+        <w:t xml:space="preserve"> reading the dataset: {error}")</w:t>
+      </w:r>
+    </w:p>
+    <w:p>
+      <w:pPr>
+        <w:rPr>
+          <w:sz w:val="38"/>
+          <w:szCs w:val="38"/>
+        </w:rPr>
+      </w:pPr>
+      <w:r>
+        <w:rPr>
+          <w:sz w:val="38"/>
+          <w:szCs w:val="38"/>
+        </w:rPr>
+        <w:t>        return</w:t>
+      </w:r>
+    </w:p>
+    <w:p>
+      <w:pPr>
+        <w:rPr>
+          <w:sz w:val="38"/>
+          <w:szCs w:val="38"/>
+        </w:rPr>
+      </w:pPr>
+    </w:p>
+    <w:p>
+      <w:pPr>
+        <w:rPr>
+          <w:sz w:val="38"/>
+          <w:szCs w:val="38"/>
+        </w:rPr>
+      </w:pPr>
+      <w:r>
+        <w:rPr>
+          <w:sz w:val="38"/>
+          <w:szCs w:val="38"/>
+        </w:rPr>
+        <w:t>    for record in records:</w:t>
+      </w:r>
+    </w:p>
+    <w:p>
+      <w:pPr>
+        <w:rPr>
+          <w:sz w:val="38"/>
+          <w:szCs w:val="38"/>
+        </w:rPr>
+      </w:pPr>
+      <w:r>
+        <w:rPr>
+          <w:sz w:val="38"/>
+          <w:szCs w:val="38"/>
+        </w:rPr>
+        <w:t>        print(</w:t>
+      </w:r>
+      <w:proofErr w:type="spellStart"/>
+      <w:r>
+        <w:rPr>
+          <w:sz w:val="38"/>
+          <w:szCs w:val="38"/>
+        </w:rPr>
+        <w:t>record.display</w:t>
+      </w:r>
+      <w:proofErr w:type="spellEnd"/>
+      <w:r>
+        <w:rPr>
+          <w:sz w:val="38"/>
+          <w:szCs w:val="38"/>
+        </w:rPr>
+        <w:t>())</w:t>
+      </w:r>
+    </w:p>
+    <w:p>
+      <w:pPr>
+        <w:rPr>
+          <w:sz w:val="38"/>
+          <w:szCs w:val="38"/>
+        </w:rPr>
+      </w:pPr>
+    </w:p>
+    <w:p>
+      <w:pPr>
+        <w:rPr>
+          <w:sz w:val="38"/>
+          <w:szCs w:val="38"/>
+        </w:rPr>
+      </w:pPr>
+    </w:p>
+    <w:p>
+      <w:pPr>
+        <w:rPr>
+          <w:sz w:val="38"/>
+          <w:szCs w:val="38"/>
+        </w:rPr>
+      </w:pPr>
+    </w:p>
+    <w:p>
+      <w:pPr>
+        <w:rPr>
+          <w:sz w:val="38"/>
+          <w:szCs w:val="38"/>
+        </w:rPr>
+      </w:pPr>
+    </w:p>
+    <w:p>
+      <w:pPr>
+        <w:rPr>
+          <w:sz w:val="38"/>
+          <w:szCs w:val="38"/>
+        </w:rPr>
+      </w:pPr>
+    </w:p>
+    <w:p>
+      <w:pPr>
+        <w:rPr>
+          <w:sz w:val="38"/>
+          <w:szCs w:val="38"/>
+        </w:rPr>
+      </w:pPr>
+    </w:p>
+    <w:p>
+      <w:pPr>
+        <w:rPr>
+          <w:sz w:val="38"/>
+          <w:szCs w:val="38"/>
+        </w:rPr>
+      </w:pPr>
+    </w:p>
+    <w:p>
+      <w:pPr>
+        <w:rPr>
+          <w:sz w:val="38"/>
+          <w:szCs w:val="38"/>
+        </w:rPr>
+      </w:pPr>
+    </w:p>
+    <w:p>
+      <w:pPr>
+        <w:rPr>
+          <w:sz w:val="38"/>
+          <w:szCs w:val="38"/>
+        </w:rPr>
+      </w:pPr>
+    </w:p>
+    <w:p>
+      <w:pPr>
+        <w:rPr>
+          <w:sz w:val="38"/>
+          <w:szCs w:val="38"/>
+        </w:rPr>
+      </w:pPr>
+    </w:p>
+    <w:p>
+      <w:pPr>
+        <w:rPr>
+          <w:sz w:val="38"/>
+          <w:szCs w:val="38"/>
+        </w:rPr>
+      </w:pPr>
+    </w:p>
+    <w:p>
+      <w:pPr>
+        <w:rPr>
+          <w:sz w:val="38"/>
+          <w:szCs w:val="38"/>
+        </w:rPr>
+      </w:pPr>
+      <w:r>
+        <w:rPr>
+          <w:sz w:val="38"/>
+          <w:szCs w:val="38"/>
+          <w:highlight w:val="yellow"/>
+        </w:rPr>
+        <w:t>References:</w:t>
+      </w:r>
+    </w:p>
+    <w:p>
+      <w:pPr>
+        <w:rPr>
+          <w:sz w:val="38"/>
+          <w:szCs w:val="38"/>
+        </w:rPr>
+      </w:pPr>
+    </w:p>
+    <w:p>
+      <w:pPr>
+        <w:rPr>
+          <w:sz w:val="38"/>
+          <w:szCs w:val="38"/>
+        </w:rPr>
+      </w:pPr>
+      <w:r>
+        <w:rPr>
+          <w:sz w:val="38"/>
+          <w:szCs w:val="38"/>
+        </w:rPr>
+        <w:t>[1]</w:t>
+      </w:r>
+    </w:p>
+    <w:p>
+      <w:pPr>
+        <w:rPr>
+          <w:sz w:val="38"/>
+          <w:szCs w:val="38"/>
+        </w:rPr>
+      </w:pPr>
+      <w:r>
+        <w:rPr>
+          <w:sz w:val="38"/>
+          <w:szCs w:val="38"/>
+        </w:rPr>
+        <w:t xml:space="preserve">J. Brown, “Git Branching and Merging: A Step-By-Step Guide,” </w:t>
+      </w:r>
+      <w:r>
+        <w:rPr>
+          <w:i/>
+          <w:iCs/>
+          <w:sz w:val="38"/>
+          <w:szCs w:val="38"/>
+        </w:rPr>
+        <w:t>Varonis.com</w:t>
+      </w:r>
+      <w:r>
+        <w:rPr>
+          <w:sz w:val="38"/>
+          <w:szCs w:val="38"/>
+        </w:rPr>
+        <w:t>, May 17, 2021. https://www.varonis.com/blog/git-branching-and-merging (accessed Sept. 25, 2026).</w:t>
+      </w:r>
+    </w:p>
+    <w:p>
+      <w:pPr>
+        <w:rPr>
+          <w:sz w:val="38"/>
+          <w:szCs w:val="38"/>
+        </w:rPr>
+      </w:pPr>
+    </w:p>
+    <w:p>
+      <w:pPr>
+        <w:rPr>
+          <w:sz w:val="38"/>
+          <w:szCs w:val="38"/>
+        </w:rPr>
+      </w:pPr>
+    </w:p>
+    <w:p>
+      <w:pPr>
+        <w:rPr>
+          <w:sz w:val="38"/>
+          <w:szCs w:val="38"/>
+        </w:rPr>
+      </w:pPr>
+      <w:r>
+        <w:rPr>
+          <w:sz w:val="38"/>
+          <w:szCs w:val="38"/>
+        </w:rPr>
+        <w:t>[</w:t>
+      </w:r>
+      <w:r>
+        <w:rPr>
+          <w:sz w:val="38"/>
+          <w:szCs w:val="38"/>
+        </w:rPr>
+        <w:t>2</w:t>
+      </w:r>
+      <w:r>
+        <w:rPr>
+          <w:sz w:val="38"/>
+          <w:szCs w:val="38"/>
+        </w:rPr>
+        <w:t>]</w:t>
+      </w:r>
+    </w:p>
+    <w:p>
+      <w:pPr>
+        <w:rPr>
+          <w:sz w:val="38"/>
+          <w:szCs w:val="38"/>
+        </w:rPr>
+      </w:pPr>
+      <w:r>
+        <w:rPr>
+          <w:sz w:val="38"/>
+          <w:szCs w:val="38"/>
+        </w:rPr>
+        <w:t xml:space="preserve">C. Schafer, “Python Tutorial: File Objects - Reading and Writing to Files,” </w:t>
+      </w:r>
+      <w:r>
+        <w:rPr>
+          <w:i/>
+          <w:iCs/>
+          <w:sz w:val="38"/>
+          <w:szCs w:val="38"/>
+        </w:rPr>
+        <w:t>YouTube</w:t>
+      </w:r>
+      <w:r>
+        <w:rPr>
+          <w:sz w:val="38"/>
+          <w:szCs w:val="38"/>
+        </w:rPr>
+        <w:t>. Apr. 29, 2016. Accessed: Sept. 25, 2026. [YouTube Video]. Available: https://www.youtube.com/watch?v=Uh2ebFW8OYM</w:t>
+      </w:r>
+    </w:p>
+    <w:p>
+      <w:pPr>
+        <w:rPr>
+          <w:sz w:val="38"/>
+          <w:szCs w:val="38"/>
+        </w:rPr>
+      </w:pPr>
+    </w:p>
+    <w:p>
+      <w:pPr>
+        <w:rPr>
+          <w:sz w:val="38"/>
+          <w:szCs w:val="38"/>
+        </w:rPr>
+      </w:pPr>
+    </w:p>
+    <w:p>
+      <w:pPr>
+        <w:rPr>
+          <w:sz w:val="38"/>
+          <w:szCs w:val="38"/>
+        </w:rPr>
+      </w:pPr>
+    </w:p>
+    <w:p>
+      <w:pPr>
+        <w:rPr>
+          <w:sz w:val="38"/>
+          <w:szCs w:val="38"/>
+        </w:rPr>
+      </w:pPr>
+    </w:p>
+    <w:p>
+      <w:pPr>
+        <w:rPr>
+          <w:sz w:val="38"/>
+          <w:szCs w:val="38"/>
+        </w:rPr>
+      </w:pPr>
+    </w:p>
+    <w:p>
+      <w:pPr>
+        <w:rPr>
+          <w:b/>
+          <w:bCs/>
+          <w:sz w:val="22"/>
+          <w:szCs w:val="22"/>
+        </w:rPr>
+      </w:pPr>
+    </w:p>
+    <w:p>
+      <w:pPr>
+        <w:jc w:val="center"/>
+        <w:rPr>
+          <w:b/>
+          <w:bCs/>
+          <w:sz w:val="22"/>
+          <w:szCs w:val="22"/>
+        </w:rPr>
+      </w:pPr>
+    </w:p>
+    <w:p>
+      <w:pPr>
+        <w:jc w:val="center"/>
+        <w:rPr>
+          <w:b/>
+          <w:bCs/>
+          <w:sz w:val="22"/>
+          <w:szCs w:val="22"/>
+        </w:rPr>
+      </w:pPr>
+    </w:p>
+    <w:p>
+      <w:pPr>
+        <w:rPr>
+          <w:sz w:val="38"/>
+          <w:szCs w:val="38"/>
+        </w:rPr>
+      </w:pPr>
     </w:p>
     <w:sectPr>
       <w:pgSz w:w="12240" w:h="15840"/>
@@ -417,6 +2985,17 @@
   <w:style w:type="paragraph" w:default="1" w:styleId="Normal">
     <w:name w:val="Normal"/>
     <w:qFormat/>
+    <w:rsid w:val="00F45BFD"/>
+    <w:pPr>
+      <w:spacing w:after="0" w:line="240" w:lineRule="auto"/>
+    </w:pPr>
+    <w:rPr>
+      <w:rFonts w:ascii="Times New Roman" w:eastAsia="Times New Roman" w:hAnsi="Times New Roman" w:cs="Times New Roman"/>
+      <w:kern w:val="0"/>
+      <w:sz w:val="20"/>
+      <w:szCs w:val="20"/>
+      <w:lang w:eastAsia="en-CA"/>
+    </w:rPr>
   </w:style>
   <w:style w:type="paragraph" w:styleId="Heading1">
     <w:name w:val="heading 1"/>
@@ -542,7 +3121,7 @@
     <w:pPr>
       <w:keepNext/>
       <w:keepLines/>
-      <w:spacing w:before="40" w:after="0"/>
+      <w:spacing w:before="40"/>
       <w:outlineLvl w:val="5"/>
     </w:pPr>
     <w:rPr>
@@ -565,7 +3144,7 @@
     <w:pPr>
       <w:keepNext/>
       <w:keepLines/>
-      <w:spacing w:before="40" w:after="0"/>
+      <w:spacing w:before="40"/>
       <w:outlineLvl w:val="6"/>
     </w:pPr>
     <w:rPr>
@@ -586,7 +3165,6 @@
     <w:pPr>
       <w:keepNext/>
       <w:keepLines/>
-      <w:spacing w:after="0"/>
       <w:outlineLvl w:val="7"/>
     </w:pPr>
     <w:rPr>
@@ -609,7 +3187,6 @@
     <w:pPr>
       <w:keepNext/>
       <w:keepLines/>
-      <w:spacing w:after="0"/>
       <w:outlineLvl w:val="8"/>
     </w:pPr>
     <w:rPr>
@@ -620,7 +3197,6 @@
   <w:style w:type="character" w:default="1" w:styleId="DefaultParagraphFont">
     <w:name w:val="Default Paragraph Font"/>
     <w:uiPriority w:val="1"/>
-    <w:semiHidden/>
     <w:unhideWhenUsed/>
   </w:style>
   <w:style w:type="table" w:default="1" w:styleId="TableNormal">
@@ -772,7 +3348,7 @@
     <w:qFormat/>
     <w:rsid w:val="00C918F6"/>
     <w:pPr>
-      <w:spacing w:after="80" w:line="240" w:lineRule="auto"/>
+      <w:spacing w:after="80"/>
       <w:contextualSpacing/>
     </w:pPr>
     <w:rPr>

</xml_diff>